<commit_message>
Corrected the dynamic splines knots
</commit_message>
<xml_diff>
--- a/study_design.docx
+++ b/study_design.docx
@@ -2,10 +2,7 @@
 <file path=word/document.xml><?xml version="1.0" encoding="utf-8"?>
 <w:document xmlns:wpc="http://schemas.microsoft.com/office/word/2010/wordprocessingCanvas" xmlns:cx="http://schemas.microsoft.com/office/drawing/2014/chartex" xmlns:cx1="http://schemas.microsoft.com/office/drawing/2015/9/8/chartex" xmlns:mc="http://schemas.openxmlformats.org/markup-compatibility/2006" xmlns:o="urn:schemas-microsoft-com:office:office" xmlns:r="http://schemas.openxmlformats.org/officeDocument/2006/relationships" xmlns:m="http://schemas.openxmlformats.org/officeDocument/2006/math" xmlns:v="urn:schemas-microsoft-com:vml" xmlns:wp14="http://schemas.microsoft.com/office/word/2010/wordprocessingDrawing" xmlns:wp="http://schemas.openxmlformats.org/drawingml/2006/wordprocessingDrawing" xmlns:w10="urn:schemas-microsoft-com:office:word" xmlns:w="http://schemas.openxmlformats.org/wordprocessingml/2006/main" xmlns:w14="http://schemas.microsoft.com/office/word/2010/wordml" xmlns:w15="http://schemas.microsoft.com/office/word/2012/wordml" xmlns:w16se="http://schemas.microsoft.com/office/word/2015/wordml/symex" xmlns:wpg="http://schemas.microsoft.com/office/word/2010/wordprocessingGroup" xmlns:wpi="http://schemas.microsoft.com/office/word/2010/wordprocessingInk" xmlns:wne="http://schemas.microsoft.com/office/word/2006/wordml" xmlns:wps="http://schemas.microsoft.com/office/word/2010/wordprocessingShape" mc:Ignorable="w14 w15 w16se wp14">
   <w:body>
-    <w:p>
-      <w:bookmarkStart w:id="0" w:name="_GoBack"/>
-      <w:bookmarkEnd w:id="0"/>
-    </w:p>
+    <w:p/>
     <w:p>
       <w:r>
         <w:rPr>
@@ -977,7 +974,7 @@
               </wp:anchor>
             </w:drawing>
           </mc:Choice>
-          <mc:Fallback xmlns:cx2="http://schemas.microsoft.com/office/drawing/2015/10/21/chartex" xmlns:cx3="http://schemas.microsoft.com/office/drawing/2016/5/9/chartex" xmlns:cx4="http://schemas.microsoft.com/office/drawing/2016/5/10/chartex" xmlns:cx5="http://schemas.microsoft.com/office/drawing/2016/5/11/chartex" xmlns:cx6="http://schemas.microsoft.com/office/drawing/2016/5/12/chartex" xmlns:cx7="http://schemas.microsoft.com/office/drawing/2016/5/13/chartex" xmlns:cx8="http://schemas.microsoft.com/office/drawing/2016/5/14/chartex" xmlns:aink="http://schemas.microsoft.com/office/drawing/2016/ink" xmlns:am3d="http://schemas.microsoft.com/office/drawing/2017/model3d" xmlns:oel="http://schemas.microsoft.com/office/2019/extlst" xmlns:w16cex="http://schemas.microsoft.com/office/word/2018/wordml/cex" xmlns:w16cid="http://schemas.microsoft.com/office/word/2016/wordml/cid" xmlns:w16="http://schemas.microsoft.com/office/word/2018/wordml" xmlns:w16du="http://schemas.microsoft.com/office/word/2023/wordml/word16du" xmlns:w16sdtdh="http://schemas.microsoft.com/office/word/2020/wordml/sdtdatahash" xmlns:w16sdtfl="http://schemas.microsoft.com/office/word/2024/wordml/sdtformatlock">
+          <mc:Fallback xmlns:w16sdtfl="http://schemas.microsoft.com/office/word/2024/wordml/sdtformatlock" xmlns:w16sdtdh="http://schemas.microsoft.com/office/word/2020/wordml/sdtdatahash" xmlns:w16du="http://schemas.microsoft.com/office/word/2023/wordml/word16du" xmlns:w16="http://schemas.microsoft.com/office/word/2018/wordml" xmlns:w16cid="http://schemas.microsoft.com/office/word/2016/wordml/cid" xmlns:w16cex="http://schemas.microsoft.com/office/word/2018/wordml/cex" xmlns:oel="http://schemas.microsoft.com/office/2019/extlst" xmlns:am3d="http://schemas.microsoft.com/office/drawing/2017/model3d" xmlns:aink="http://schemas.microsoft.com/office/drawing/2016/ink" xmlns:cx8="http://schemas.microsoft.com/office/drawing/2016/5/14/chartex" xmlns:cx7="http://schemas.microsoft.com/office/drawing/2016/5/13/chartex" xmlns:cx6="http://schemas.microsoft.com/office/drawing/2016/5/12/chartex" xmlns:cx5="http://schemas.microsoft.com/office/drawing/2016/5/11/chartex" xmlns:cx4="http://schemas.microsoft.com/office/drawing/2016/5/10/chartex" xmlns:cx3="http://schemas.microsoft.com/office/drawing/2016/5/9/chartex" xmlns:cx2="http://schemas.microsoft.com/office/drawing/2015/10/21/chartex">
             <w:pict>
               <v:shape w14:anchorId="4930B9D1" id="Connecteur droit avec flèche 6" o:spid="_x0000_s1026" type="#_x0000_t32" style="position:absolute;margin-left:154.8pt;margin-top:1.65pt;width:0;height:45.35pt;z-index:251697152;visibility:visible;mso-wrap-style:square;mso-wrap-distance-left:9pt;mso-wrap-distance-top:0;mso-wrap-distance-right:9pt;mso-wrap-distance-bottom:0;mso-position-horizontal:absolute;mso-position-horizontal-relative:text;mso-position-vertical:absolute;mso-position-vertical-relative:text" o:gfxdata="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" strokecolor="black [3200]" strokeweight=".5pt">
                 <v:stroke endarrow="block" joinstyle="miter"/>
@@ -1153,7 +1150,180 @@
         <mc:AlternateContent>
           <mc:Choice Requires="wps">
             <w:drawing>
-              <wp:anchor distT="45720" distB="45720" distL="114300" distR="114300" simplePos="0" relativeHeight="251673600" behindDoc="0" locked="0" layoutInCell="1" allowOverlap="1" wp14:anchorId="7371F9AE" wp14:editId="19FD69DB">
+              <wp:anchor distT="45720" distB="45720" distL="114300" distR="114300" simplePos="0" relativeHeight="251693056" behindDoc="0" locked="0" layoutInCell="1" allowOverlap="1" wp14:anchorId="76DACD70" wp14:editId="43CBD95A">
+                <wp:simplePos x="0" y="0"/>
+                <wp:positionH relativeFrom="column">
+                  <wp:posOffset>852805</wp:posOffset>
+                </wp:positionH>
+                <wp:positionV relativeFrom="paragraph">
+                  <wp:posOffset>2463165</wp:posOffset>
+                </wp:positionV>
+                <wp:extent cx="2394585" cy="1404620"/>
+                <wp:effectExtent l="0" t="0" r="0" b="0"/>
+                <wp:wrapSquare wrapText="bothSides"/>
+                <wp:docPr id="230643714" name="Zone de texte 2"/>
+                <wp:cNvGraphicFramePr>
+                  <a:graphicFrameLocks xmlns:a="http://schemas.openxmlformats.org/drawingml/2006/main"/>
+                </wp:cNvGraphicFramePr>
+                <a:graphic xmlns:a="http://schemas.openxmlformats.org/drawingml/2006/main">
+                  <a:graphicData uri="http://schemas.microsoft.com/office/word/2010/wordprocessingShape">
+                    <wps:wsp>
+                      <wps:cNvSpPr txBox="1">
+                        <a:spLocks noChangeArrowheads="1"/>
+                      </wps:cNvSpPr>
+                      <wps:spPr bwMode="auto">
+                        <a:xfrm>
+                          <a:off x="0" y="0"/>
+                          <a:ext cx="2394585" cy="1404620"/>
+                        </a:xfrm>
+                        <a:prstGeom prst="rect">
+                          <a:avLst/>
+                        </a:prstGeom>
+                        <a:noFill/>
+                        <a:ln w="9525">
+                          <a:noFill/>
+                          <a:miter lim="800000"/>
+                          <a:headEnd/>
+                          <a:tailEnd/>
+                        </a:ln>
+                      </wps:spPr>
+                      <wps:txbx>
+                        <w:txbxContent>
+                          <w:p>
+                            <w:pPr>
+                              <w:jc w:val="both"/>
+                              <w:rPr>
+                                <w:rFonts w:ascii="Times New Roman" w:hAnsi="Times New Roman" w:cs="Times New Roman"/>
+                                <w:i/>
+                                <w:iCs/>
+                                <w:sz w:val="18"/>
+                                <w:szCs w:val="14"/>
+                                <w:lang w:val="en-US"/>
+                              </w:rPr>
+                            </w:pPr>
+                            <w:r>
+                              <w:rPr>
+                                <w:rFonts w:ascii="Times New Roman" w:hAnsi="Times New Roman" w:cs="Times New Roman"/>
+                                <w:i/>
+                                <w:iCs/>
+                                <w:sz w:val="18"/>
+                                <w:szCs w:val="14"/>
+                                <w:lang w:val="en-US"/>
+                              </w:rPr>
+                              <w:t>*Observations included involve CA-125 levels</w:t>
+                            </w:r>
+                            <w:r>
+                              <w:rPr>
+                                <w:rFonts w:ascii="Times New Roman" w:hAnsi="Times New Roman" w:cs="Times New Roman"/>
+                                <w:i/>
+                                <w:iCs/>
+                                <w:sz w:val="18"/>
+                                <w:szCs w:val="14"/>
+                                <w:lang w:val="en-US"/>
+                              </w:rPr>
+                              <w:t xml:space="preserve"> measured before progression, from</w:t>
+                            </w:r>
+                            <w:r>
+                              <w:rPr>
+                                <w:rFonts w:ascii="Times New Roman" w:hAnsi="Times New Roman" w:cs="Times New Roman"/>
+                                <w:i/>
+                                <w:iCs/>
+                                <w:sz w:val="18"/>
+                                <w:szCs w:val="14"/>
+                                <w:lang w:val="en-US"/>
+                              </w:rPr>
+                              <w:t xml:space="preserve"> 0 to 188 days</w:t>
+                            </w:r>
+                          </w:p>
+                        </w:txbxContent>
+                      </wps:txbx>
+                      <wps:bodyPr rot="0" vert="horz" wrap="square" lIns="91440" tIns="45720" rIns="91440" bIns="45720" anchor="t" anchorCtr="0">
+                        <a:spAutoFit/>
+                      </wps:bodyPr>
+                    </wps:wsp>
+                  </a:graphicData>
+                </a:graphic>
+                <wp14:sizeRelH relativeFrom="margin">
+                  <wp14:pctWidth>0</wp14:pctWidth>
+                </wp14:sizeRelH>
+                <wp14:sizeRelV relativeFrom="margin">
+                  <wp14:pctHeight>20000</wp14:pctHeight>
+                </wp14:sizeRelV>
+              </wp:anchor>
+            </w:drawing>
+          </mc:Choice>
+          <mc:Fallback>
+            <w:pict>
+              <v:shapetype w14:anchorId="76DACD70" id="_x0000_t202" coordsize="21600,21600" o:spt="202" path="m,l,21600r21600,l21600,xe">
+                <v:stroke joinstyle="miter"/>
+                <v:path gradientshapeok="t" o:connecttype="rect"/>
+              </v:shapetype>
+              <v:shape id="_x0000_s1030" type="#_x0000_t202" style="position:absolute;margin-left:67.15pt;margin-top:193.95pt;width:188.55pt;height:110.6pt;z-index:251693056;visibility:visible;mso-wrap-style:square;mso-width-percent:0;mso-height-percent:200;mso-wrap-distance-left:9pt;mso-wrap-distance-top:3.6pt;mso-wrap-distance-right:9pt;mso-wrap-distance-bottom:3.6pt;mso-position-horizontal:absolute;mso-position-horizontal-relative:text;mso-position-vertical:absolute;mso-position-vertical-relative:text;mso-width-percent:0;mso-height-percent:200;mso-width-relative:margin;mso-height-relative:margin;v-text-anchor:top" o:gfxdata="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" filled="f" stroked="f">
+                <v:textbox style="mso-fit-shape-to-text:t">
+                  <w:txbxContent>
+                    <w:p>
+                      <w:pPr>
+                        <w:jc w:val="both"/>
+                        <w:rPr>
+                          <w:rFonts w:ascii="Times New Roman" w:hAnsi="Times New Roman" w:cs="Times New Roman"/>
+                          <w:i/>
+                          <w:iCs/>
+                          <w:sz w:val="18"/>
+                          <w:szCs w:val="14"/>
+                          <w:lang w:val="en-US"/>
+                        </w:rPr>
+                      </w:pPr>
+                      <w:r>
+                        <w:rPr>
+                          <w:rFonts w:ascii="Times New Roman" w:hAnsi="Times New Roman" w:cs="Times New Roman"/>
+                          <w:i/>
+                          <w:iCs/>
+                          <w:sz w:val="18"/>
+                          <w:szCs w:val="14"/>
+                          <w:lang w:val="en-US"/>
+                        </w:rPr>
+                        <w:t>*Observations included involve CA-125 levels</w:t>
+                      </w:r>
+                      <w:r>
+                        <w:rPr>
+                          <w:rFonts w:ascii="Times New Roman" w:hAnsi="Times New Roman" w:cs="Times New Roman"/>
+                          <w:i/>
+                          <w:iCs/>
+                          <w:sz w:val="18"/>
+                          <w:szCs w:val="14"/>
+                          <w:lang w:val="en-US"/>
+                        </w:rPr>
+                        <w:t xml:space="preserve"> measured before progression, from</w:t>
+                      </w:r>
+                      <w:r>
+                        <w:rPr>
+                          <w:rFonts w:ascii="Times New Roman" w:hAnsi="Times New Roman" w:cs="Times New Roman"/>
+                          <w:i/>
+                          <w:iCs/>
+                          <w:sz w:val="18"/>
+                          <w:szCs w:val="14"/>
+                          <w:lang w:val="en-US"/>
+                        </w:rPr>
+                        <w:t xml:space="preserve"> 0 to 188 days</w:t>
+                      </w:r>
+                    </w:p>
+                  </w:txbxContent>
+                </v:textbox>
+                <w10:wrap type="square"/>
+              </v:shape>
+            </w:pict>
+          </mc:Fallback>
+        </mc:AlternateContent>
+      </w:r>
+      <w:r>
+        <w:rPr>
+          <w:noProof/>
+          <w:lang w:eastAsia="fr-FR"/>
+        </w:rPr>
+        <mc:AlternateContent>
+          <mc:Choice Requires="wps">
+            <w:drawing>
+              <wp:anchor distT="45720" distB="45720" distL="114300" distR="114300" simplePos="0" relativeHeight="251673600" behindDoc="0" locked="0" layoutInCell="1" allowOverlap="1" wp14:anchorId="7371F9AE" wp14:editId="79D15B5E">
                 <wp:simplePos x="0" y="0"/>
                 <wp:positionH relativeFrom="column">
                   <wp:posOffset>911225</wp:posOffset>
@@ -1313,7 +1483,7 @@
           </mc:Choice>
           <mc:Fallback>
             <w:pict>
-              <v:shape w14:anchorId="7371F9AE" id="_x0000_s1030" type="#_x0000_t202" style="position:absolute;margin-left:71.75pt;margin-top:266pt;width:185.9pt;height:104pt;z-index:251673600;visibility:visible;mso-wrap-style:square;mso-width-percent:400;mso-height-percent:0;mso-wrap-distance-left:9pt;mso-wrap-distance-top:3.6pt;mso-wrap-distance-right:9pt;mso-wrap-distance-bottom:3.6pt;mso-position-horizontal:absolute;mso-position-horizontal-relative:text;mso-position-vertical:absolute;mso-position-vertical-relative:text;mso-width-percent:400;mso-height-percent:0;mso-width-relative:margin;mso-height-relative:margin;v-text-anchor:top" o:gfxdata="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">
+              <v:shape w14:anchorId="7371F9AE" id="_x0000_s1031" type="#_x0000_t202" style="position:absolute;margin-left:71.75pt;margin-top:266pt;width:185.9pt;height:104pt;z-index:251673600;visibility:visible;mso-wrap-style:square;mso-width-percent:400;mso-height-percent:0;mso-wrap-distance-left:9pt;mso-wrap-distance-top:3.6pt;mso-wrap-distance-right:9pt;mso-wrap-distance-bottom:3.6pt;mso-position-horizontal:absolute;mso-position-horizontal-relative:text;mso-position-vertical:absolute;mso-position-vertical-relative:text;mso-width-percent:400;mso-height-percent:0;mso-width-relative:margin;mso-height-relative:margin;v-text-anchor:top" o:gfxdata="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">
                 <v:textbox>
                   <w:txbxContent>
                     <w:p>
@@ -1422,6 +1592,8 @@
           </mc:Fallback>
         </mc:AlternateContent>
       </w:r>
+      <w:bookmarkStart w:id="0" w:name="_GoBack"/>
+      <w:bookmarkEnd w:id="0"/>
       <w:r>
         <w:rPr>
           <w:noProof/>
@@ -1430,540 +1602,7 @@
         <mc:AlternateContent>
           <mc:Choice Requires="wps">
             <w:drawing>
-              <wp:anchor distT="45720" distB="45720" distL="114300" distR="114300" simplePos="0" relativeHeight="251693056" behindDoc="0" locked="0" layoutInCell="1" allowOverlap="1" wp14:anchorId="76DACD70" wp14:editId="0055B9BA">
-                <wp:simplePos x="0" y="0"/>
-                <wp:positionH relativeFrom="column">
-                  <wp:posOffset>852170</wp:posOffset>
-                </wp:positionH>
-                <wp:positionV relativeFrom="paragraph">
-                  <wp:posOffset>2466340</wp:posOffset>
-                </wp:positionV>
-                <wp:extent cx="2338705" cy="1404620"/>
-                <wp:effectExtent l="0" t="0" r="0" b="0"/>
-                <wp:wrapSquare wrapText="bothSides"/>
-                <wp:docPr id="230643714" name="Zone de texte 2"/>
-                <wp:cNvGraphicFramePr>
-                  <a:graphicFrameLocks xmlns:a="http://schemas.openxmlformats.org/drawingml/2006/main"/>
-                </wp:cNvGraphicFramePr>
-                <a:graphic xmlns:a="http://schemas.openxmlformats.org/drawingml/2006/main">
-                  <a:graphicData uri="http://schemas.microsoft.com/office/word/2010/wordprocessingShape">
-                    <wps:wsp>
-                      <wps:cNvSpPr txBox="1">
-                        <a:spLocks noChangeArrowheads="1"/>
-                      </wps:cNvSpPr>
-                      <wps:spPr bwMode="auto">
-                        <a:xfrm>
-                          <a:off x="0" y="0"/>
-                          <a:ext cx="2338705" cy="1404620"/>
-                        </a:xfrm>
-                        <a:prstGeom prst="rect">
-                          <a:avLst/>
-                        </a:prstGeom>
-                        <a:noFill/>
-                        <a:ln w="9525">
-                          <a:noFill/>
-                          <a:miter lim="800000"/>
-                          <a:headEnd/>
-                          <a:tailEnd/>
-                        </a:ln>
-                      </wps:spPr>
-                      <wps:txbx>
-                        <w:txbxContent>
-                          <w:p>
-                            <w:pPr>
-                              <w:jc w:val="both"/>
-                              <w:rPr>
-                                <w:rFonts w:ascii="Times New Roman" w:hAnsi="Times New Roman" w:cs="Times New Roman"/>
-                                <w:i/>
-                                <w:iCs/>
-                                <w:sz w:val="18"/>
-                                <w:szCs w:val="14"/>
-                                <w:lang w:val="en-US"/>
-                              </w:rPr>
-                            </w:pPr>
-                            <w:r>
-                              <w:rPr>
-                                <w:rFonts w:ascii="Times New Roman" w:hAnsi="Times New Roman" w:cs="Times New Roman"/>
-                                <w:i/>
-                                <w:iCs/>
-                                <w:sz w:val="18"/>
-                                <w:szCs w:val="14"/>
-                                <w:lang w:val="en-US"/>
-                              </w:rPr>
-                              <w:t>*Observations included involve CA-125 levels measured before progression, for 0 to 188 days</w:t>
-                            </w:r>
-                          </w:p>
-                        </w:txbxContent>
-                      </wps:txbx>
-                      <wps:bodyPr rot="0" vert="horz" wrap="square" lIns="91440" tIns="45720" rIns="91440" bIns="45720" anchor="t" anchorCtr="0">
-                        <a:spAutoFit/>
-                      </wps:bodyPr>
-                    </wps:wsp>
-                  </a:graphicData>
-                </a:graphic>
-                <wp14:sizeRelH relativeFrom="margin">
-                  <wp14:pctWidth>0</wp14:pctWidth>
-                </wp14:sizeRelH>
-                <wp14:sizeRelV relativeFrom="margin">
-                  <wp14:pctHeight>20000</wp14:pctHeight>
-                </wp14:sizeRelV>
-              </wp:anchor>
-            </w:drawing>
-          </mc:Choice>
-          <mc:Fallback>
-            <w:pict>
-              <v:shape w14:anchorId="76DACD70" id="_x0000_s1031" type="#_x0000_t202" style="position:absolute;margin-left:67.1pt;margin-top:194.2pt;width:184.15pt;height:110.6pt;z-index:251693056;visibility:visible;mso-wrap-style:square;mso-width-percent:0;mso-height-percent:200;mso-wrap-distance-left:9pt;mso-wrap-distance-top:3.6pt;mso-wrap-distance-right:9pt;mso-wrap-distance-bottom:3.6pt;mso-position-horizontal:absolute;mso-position-horizontal-relative:text;mso-position-vertical:absolute;mso-position-vertical-relative:text;mso-width-percent:0;mso-height-percent:200;mso-width-relative:margin;mso-height-relative:margin;v-text-anchor:top" o:gfxdata="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" filled="f" stroked="f">
-                <v:textbox style="mso-fit-shape-to-text:t">
-                  <w:txbxContent>
-                    <w:p>
-                      <w:pPr>
-                        <w:jc w:val="both"/>
-                        <w:rPr>
-                          <w:rFonts w:ascii="Times New Roman" w:hAnsi="Times New Roman" w:cs="Times New Roman"/>
-                          <w:i/>
-                          <w:iCs/>
-                          <w:sz w:val="18"/>
-                          <w:szCs w:val="14"/>
-                          <w:lang w:val="en-US"/>
-                        </w:rPr>
-                      </w:pPr>
-                      <w:r>
-                        <w:rPr>
-                          <w:rFonts w:ascii="Times New Roman" w:hAnsi="Times New Roman" w:cs="Times New Roman"/>
-                          <w:i/>
-                          <w:iCs/>
-                          <w:sz w:val="18"/>
-                          <w:szCs w:val="14"/>
-                          <w:lang w:val="en-US"/>
-                        </w:rPr>
-                        <w:t>*Observations included involve CA-125 levels measured before progression, for 0 to 188 days</w:t>
-                      </w:r>
-                    </w:p>
-                  </w:txbxContent>
-                </v:textbox>
-                <w10:wrap type="square"/>
-              </v:shape>
-            </w:pict>
-          </mc:Fallback>
-        </mc:AlternateContent>
-      </w:r>
-      <w:r>
-        <w:rPr>
-          <w:noProof/>
-          <w:lang w:eastAsia="fr-FR"/>
-        </w:rPr>
-        <mc:AlternateContent>
-          <mc:Choice Requires="wps">
-            <w:drawing>
-              <wp:anchor distT="0" distB="0" distL="114300" distR="114300" simplePos="0" relativeHeight="251703296" behindDoc="0" locked="0" layoutInCell="1" allowOverlap="1" wp14:anchorId="24DE0C68" wp14:editId="18FB6B72">
-                <wp:simplePos x="0" y="0"/>
-                <wp:positionH relativeFrom="column">
-                  <wp:posOffset>4950460</wp:posOffset>
-                </wp:positionH>
-                <wp:positionV relativeFrom="paragraph">
-                  <wp:posOffset>3206115</wp:posOffset>
-                </wp:positionV>
-                <wp:extent cx="0" cy="575310"/>
-                <wp:effectExtent l="76200" t="0" r="57150" b="53340"/>
-                <wp:wrapNone/>
-                <wp:docPr id="4" name="Connecteur droit avec flèche 6"/>
-                <wp:cNvGraphicFramePr/>
-                <a:graphic xmlns:a="http://schemas.openxmlformats.org/drawingml/2006/main">
-                  <a:graphicData uri="http://schemas.microsoft.com/office/word/2010/wordprocessingShape">
-                    <wps:wsp>
-                      <wps:cNvCnPr/>
-                      <wps:spPr>
-                        <a:xfrm>
-                          <a:off x="0" y="0"/>
-                          <a:ext cx="0" cy="575310"/>
-                        </a:xfrm>
-                        <a:prstGeom prst="straightConnector1">
-                          <a:avLst/>
-                        </a:prstGeom>
-                        <a:ln>
-                          <a:tailEnd type="triangle"/>
-                        </a:ln>
-                      </wps:spPr>
-                      <wps:style>
-                        <a:lnRef idx="1">
-                          <a:schemeClr val="dk1"/>
-                        </a:lnRef>
-                        <a:fillRef idx="0">
-                          <a:schemeClr val="dk1"/>
-                        </a:fillRef>
-                        <a:effectRef idx="0">
-                          <a:schemeClr val="dk1"/>
-                        </a:effectRef>
-                        <a:fontRef idx="minor">
-                          <a:schemeClr val="tx1"/>
-                        </a:fontRef>
-                      </wps:style>
-                      <wps:bodyPr/>
-                    </wps:wsp>
-                  </a:graphicData>
-                </a:graphic>
-              </wp:anchor>
-            </w:drawing>
-          </mc:Choice>
-          <mc:Fallback>
-            <w:pict>
-              <v:shapetype w14:anchorId="4B17079F" id="_x0000_t32" coordsize="21600,21600" o:spt="32" o:oned="t" path="m,l21600,21600e" filled="f">
-                <v:path arrowok="t" fillok="f" o:connecttype="none"/>
-                <o:lock v:ext="edit" shapetype="t"/>
-              </v:shapetype>
-              <v:shape id="Connecteur droit avec flèche 6" o:spid="_x0000_s1026" type="#_x0000_t32" style="position:absolute;margin-left:389.8pt;margin-top:252.45pt;width:0;height:45.3pt;z-index:251703296;visibility:visible;mso-wrap-style:square;mso-wrap-distance-left:9pt;mso-wrap-distance-top:0;mso-wrap-distance-right:9pt;mso-wrap-distance-bottom:0;mso-position-horizontal:absolute;mso-position-horizontal-relative:text;mso-position-vertical:absolute;mso-position-vertical-relative:text" o:gfxdata="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" strokecolor="black [3200]" strokeweight=".5pt">
-                <v:stroke endarrow="block" joinstyle="miter"/>
-              </v:shape>
-            </w:pict>
-          </mc:Fallback>
-        </mc:AlternateContent>
-      </w:r>
-      <w:r>
-        <w:rPr>
-          <w:noProof/>
-          <w:lang w:eastAsia="fr-FR"/>
-        </w:rPr>
-        <mc:AlternateContent>
-          <mc:Choice Requires="wps">
-            <w:drawing>
-              <wp:anchor distT="45720" distB="45720" distL="114300" distR="114300" simplePos="0" relativeHeight="251701248" behindDoc="0" locked="0" layoutInCell="1" allowOverlap="1" wp14:anchorId="61367F9E" wp14:editId="0936DE50">
-                <wp:simplePos x="0" y="0"/>
-                <wp:positionH relativeFrom="column">
-                  <wp:posOffset>3524885</wp:posOffset>
-                </wp:positionH>
-                <wp:positionV relativeFrom="paragraph">
-                  <wp:posOffset>3758565</wp:posOffset>
-                </wp:positionV>
-                <wp:extent cx="2810510" cy="1404620"/>
-                <wp:effectExtent l="0" t="0" r="27940" b="24130"/>
-                <wp:wrapSquare wrapText="bothSides"/>
-                <wp:docPr id="2" name="Zone de texte 2"/>
-                <wp:cNvGraphicFramePr>
-                  <a:graphicFrameLocks xmlns:a="http://schemas.openxmlformats.org/drawingml/2006/main"/>
-                </wp:cNvGraphicFramePr>
-                <a:graphic xmlns:a="http://schemas.openxmlformats.org/drawingml/2006/main">
-                  <a:graphicData uri="http://schemas.microsoft.com/office/word/2010/wordprocessingShape">
-                    <wps:wsp>
-                      <wps:cNvSpPr txBox="1">
-                        <a:spLocks noChangeArrowheads="1"/>
-                      </wps:cNvSpPr>
-                      <wps:spPr bwMode="auto">
-                        <a:xfrm>
-                          <a:off x="0" y="0"/>
-                          <a:ext cx="2810510" cy="1404620"/>
-                        </a:xfrm>
-                        <a:prstGeom prst="rect">
-                          <a:avLst/>
-                        </a:prstGeom>
-                        <a:solidFill>
-                          <a:srgbClr val="FFFFFF"/>
-                        </a:solidFill>
-                        <a:ln w="9525">
-                          <a:solidFill>
-                            <a:srgbClr val="000000"/>
-                          </a:solidFill>
-                          <a:miter lim="800000"/>
-                          <a:headEnd/>
-                          <a:tailEnd/>
-                        </a:ln>
-                      </wps:spPr>
-                      <wps:txbx>
-                        <w:txbxContent>
-                          <w:p>
-                            <w:pPr>
-                              <w:jc w:val="center"/>
-                              <w:rPr>
-                                <w:rFonts w:ascii="Times New Roman" w:hAnsi="Times New Roman" w:cs="Times New Roman"/>
-                                <w:lang w:val="en-US"/>
-                              </w:rPr>
-                            </w:pPr>
-                            <w:r>
-                              <w:rPr>
-                                <w:rFonts w:ascii="Times New Roman" w:hAnsi="Times New Roman" w:cs="Times New Roman"/>
-                                <w:lang w:val="en-US"/>
-                              </w:rPr>
-                              <w:t>Patient not eligible for KELIM calculations</w:t>
-                            </w:r>
-                          </w:p>
-                          <w:p>
-                            <w:pPr>
-                              <w:pStyle w:val="Paragraphedeliste"/>
-                              <w:numPr>
-                                <w:ilvl w:val="0"/>
-                                <w:numId w:val="2"/>
-                              </w:numPr>
-                              <w:jc w:val="both"/>
-                              <w:rPr>
-                                <w:rFonts w:ascii="Times New Roman" w:hAnsi="Times New Roman" w:cs="Times New Roman"/>
-                                <w:lang w:val="en-US"/>
-                              </w:rPr>
-                            </w:pPr>
-                            <w:r>
-                              <w:rPr>
-                                <w:rFonts w:ascii="Times New Roman" w:hAnsi="Times New Roman" w:cs="Times New Roman"/>
-                                <w:lang w:val="en-US"/>
-                              </w:rPr>
-                              <w:t>Due to randomization after first line of treatment: N =1</w:t>
-                            </w:r>
-                            <w:r>
-                              <w:rPr>
-                                <w:rFonts w:ascii="Times New Roman" w:hAnsi="Times New Roman" w:cs="Times New Roman"/>
-                                <w:lang w:val="en-US"/>
-                              </w:rPr>
-                              <w:t>,</w:t>
-                            </w:r>
-                            <w:r>
-                              <w:rPr>
-                                <w:rFonts w:ascii="Times New Roman" w:hAnsi="Times New Roman" w:cs="Times New Roman"/>
-                                <w:lang w:val="en-US"/>
-                              </w:rPr>
-                              <w:t>007 patients, n= 2 trials (CCTG-OV.12, EORTC-</w:t>
-                            </w:r>
-                            <w:r>
-                              <w:rPr>
-                                <w:rFonts w:ascii="Times New Roman" w:hAnsi="Times New Roman" w:cs="Times New Roman"/>
-                                <w:lang w:val="en-US"/>
-                              </w:rPr>
-                              <w:t>55041</w:t>
-                            </w:r>
-                            <w:r>
-                              <w:rPr>
-                                <w:rFonts w:ascii="Times New Roman" w:hAnsi="Times New Roman" w:cs="Times New Roman"/>
-                                <w:lang w:val="en-US"/>
-                              </w:rPr>
-                              <w:t>)</w:t>
-                            </w:r>
-                          </w:p>
-                          <w:p>
-                            <w:pPr>
-                              <w:pStyle w:val="Paragraphedeliste"/>
-                              <w:numPr>
-                                <w:ilvl w:val="0"/>
-                                <w:numId w:val="2"/>
-                              </w:numPr>
-                              <w:jc w:val="both"/>
-                              <w:rPr>
-                                <w:rFonts w:ascii="Times New Roman" w:hAnsi="Times New Roman" w:cs="Times New Roman"/>
-                                <w:lang w:val="en-US"/>
-                              </w:rPr>
-                            </w:pPr>
-                            <w:r>
-                              <w:rPr>
-                                <w:rFonts w:ascii="Times New Roman" w:hAnsi="Times New Roman" w:cs="Times New Roman"/>
-                                <w:lang w:val="en-US"/>
-                              </w:rPr>
-                              <w:t>Due to &lt; 3 CA-125 measurements during first 100 days of treatment : N = 1</w:t>
-                            </w:r>
-                            <w:r>
-                              <w:rPr>
-                                <w:rFonts w:ascii="Times New Roman" w:hAnsi="Times New Roman" w:cs="Times New Roman"/>
-                                <w:lang w:val="en-US"/>
-                              </w:rPr>
-                              <w:t>,</w:t>
-                            </w:r>
-                            <w:r>
-                              <w:rPr>
-                                <w:rFonts w:ascii="Times New Roman" w:hAnsi="Times New Roman" w:cs="Times New Roman"/>
-                                <w:lang w:val="en-US"/>
-                              </w:rPr>
-                              <w:t>312 patients, n = 3 trials (DoC</w:t>
-                            </w:r>
-                            <w:r>
-                              <w:rPr>
-                                <w:rFonts w:ascii="Times New Roman" w:hAnsi="Times New Roman" w:cs="Times New Roman"/>
-                                <w:lang w:val="en-US"/>
-                              </w:rPr>
-                              <w:t>a</w:t>
-                            </w:r>
-                            <w:r>
-                              <w:rPr>
-                                <w:rFonts w:ascii="Times New Roman" w:hAnsi="Times New Roman" w:cs="Times New Roman"/>
-                                <w:lang w:val="en-US"/>
-                              </w:rPr>
-                              <w:t>C</w:t>
-                            </w:r>
-                            <w:r>
-                              <w:rPr>
-                                <w:rFonts w:ascii="Times New Roman" w:hAnsi="Times New Roman" w:cs="Times New Roman"/>
-                                <w:lang w:val="en-US"/>
-                              </w:rPr>
-                              <w:t>el, MITO-7, VDB-2014</w:t>
-                            </w:r>
-                            <w:r>
-                              <w:rPr>
-                                <w:rFonts w:ascii="Times New Roman" w:hAnsi="Times New Roman" w:cs="Times New Roman"/>
-                                <w:lang w:val="en-US"/>
-                              </w:rPr>
-                              <w:t xml:space="preserve">) </w:t>
-                            </w:r>
-                          </w:p>
-                        </w:txbxContent>
-                      </wps:txbx>
-                      <wps:bodyPr rot="0" vert="horz" wrap="square" lIns="91440" tIns="45720" rIns="91440" bIns="45720" anchor="t" anchorCtr="0">
-                        <a:spAutoFit/>
-                      </wps:bodyPr>
-                    </wps:wsp>
-                  </a:graphicData>
-                </a:graphic>
-                <wp14:sizeRelH relativeFrom="margin">
-                  <wp14:pctWidth>0</wp14:pctWidth>
-                </wp14:sizeRelH>
-                <wp14:sizeRelV relativeFrom="margin">
-                  <wp14:pctHeight>20000</wp14:pctHeight>
-                </wp14:sizeRelV>
-              </wp:anchor>
-            </w:drawing>
-          </mc:Choice>
-          <mc:Fallback>
-            <w:pict>
-              <v:shape w14:anchorId="61367F9E" id="_x0000_s1032" type="#_x0000_t202" style="position:absolute;margin-left:277.55pt;margin-top:295.95pt;width:221.3pt;height:110.6pt;z-index:251701248;visibility:visible;mso-wrap-style:square;mso-width-percent:0;mso-height-percent:200;mso-wrap-distance-left:9pt;mso-wrap-distance-top:3.6pt;mso-wrap-distance-right:9pt;mso-wrap-distance-bottom:3.6pt;mso-position-horizontal:absolute;mso-position-horizontal-relative:text;mso-position-vertical:absolute;mso-position-vertical-relative:text;mso-width-percent:0;mso-height-percent:200;mso-width-relative:margin;mso-height-relative:margin;v-text-anchor:top" o:gfxdata="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">
-                <v:textbox style="mso-fit-shape-to-text:t">
-                  <w:txbxContent>
-                    <w:p>
-                      <w:pPr>
-                        <w:jc w:val="center"/>
-                        <w:rPr>
-                          <w:rFonts w:ascii="Times New Roman" w:hAnsi="Times New Roman" w:cs="Times New Roman"/>
-                          <w:lang w:val="en-US"/>
-                        </w:rPr>
-                      </w:pPr>
-                      <w:r>
-                        <w:rPr>
-                          <w:rFonts w:ascii="Times New Roman" w:hAnsi="Times New Roman" w:cs="Times New Roman"/>
-                          <w:lang w:val="en-US"/>
-                        </w:rPr>
-                        <w:t>Patient not eligible for KELIM calculations</w:t>
-                      </w:r>
-                    </w:p>
-                    <w:p>
-                      <w:pPr>
-                        <w:pStyle w:val="Paragraphedeliste"/>
-                        <w:numPr>
-                          <w:ilvl w:val="0"/>
-                          <w:numId w:val="2"/>
-                        </w:numPr>
-                        <w:jc w:val="both"/>
-                        <w:rPr>
-                          <w:rFonts w:ascii="Times New Roman" w:hAnsi="Times New Roman" w:cs="Times New Roman"/>
-                          <w:lang w:val="en-US"/>
-                        </w:rPr>
-                      </w:pPr>
-                      <w:r>
-                        <w:rPr>
-                          <w:rFonts w:ascii="Times New Roman" w:hAnsi="Times New Roman" w:cs="Times New Roman"/>
-                          <w:lang w:val="en-US"/>
-                        </w:rPr>
-                        <w:t>Due to randomization after first line of treatment: N =1</w:t>
-                      </w:r>
-                      <w:r>
-                        <w:rPr>
-                          <w:rFonts w:ascii="Times New Roman" w:hAnsi="Times New Roman" w:cs="Times New Roman"/>
-                          <w:lang w:val="en-US"/>
-                        </w:rPr>
-                        <w:t>,</w:t>
-                      </w:r>
-                      <w:r>
-                        <w:rPr>
-                          <w:rFonts w:ascii="Times New Roman" w:hAnsi="Times New Roman" w:cs="Times New Roman"/>
-                          <w:lang w:val="en-US"/>
-                        </w:rPr>
-                        <w:t>007 patients, n= 2 trials (CCTG-OV.12, EORTC-</w:t>
-                      </w:r>
-                      <w:r>
-                        <w:rPr>
-                          <w:rFonts w:ascii="Times New Roman" w:hAnsi="Times New Roman" w:cs="Times New Roman"/>
-                          <w:lang w:val="en-US"/>
-                        </w:rPr>
-                        <w:t>55041</w:t>
-                      </w:r>
-                      <w:r>
-                        <w:rPr>
-                          <w:rFonts w:ascii="Times New Roman" w:hAnsi="Times New Roman" w:cs="Times New Roman"/>
-                          <w:lang w:val="en-US"/>
-                        </w:rPr>
-                        <w:t>)</w:t>
-                      </w:r>
-                    </w:p>
-                    <w:p>
-                      <w:pPr>
-                        <w:pStyle w:val="Paragraphedeliste"/>
-                        <w:numPr>
-                          <w:ilvl w:val="0"/>
-                          <w:numId w:val="2"/>
-                        </w:numPr>
-                        <w:jc w:val="both"/>
-                        <w:rPr>
-                          <w:rFonts w:ascii="Times New Roman" w:hAnsi="Times New Roman" w:cs="Times New Roman"/>
-                          <w:lang w:val="en-US"/>
-                        </w:rPr>
-                      </w:pPr>
-                      <w:r>
-                        <w:rPr>
-                          <w:rFonts w:ascii="Times New Roman" w:hAnsi="Times New Roman" w:cs="Times New Roman"/>
-                          <w:lang w:val="en-US"/>
-                        </w:rPr>
-                        <w:t>Due to &lt; 3 CA-125 measurements during first 100 days of treatment : N = 1</w:t>
-                      </w:r>
-                      <w:r>
-                        <w:rPr>
-                          <w:rFonts w:ascii="Times New Roman" w:hAnsi="Times New Roman" w:cs="Times New Roman"/>
-                          <w:lang w:val="en-US"/>
-                        </w:rPr>
-                        <w:t>,</w:t>
-                      </w:r>
-                      <w:r>
-                        <w:rPr>
-                          <w:rFonts w:ascii="Times New Roman" w:hAnsi="Times New Roman" w:cs="Times New Roman"/>
-                          <w:lang w:val="en-US"/>
-                        </w:rPr>
-                        <w:t>312 patients, n = 3 trials (DoC</w:t>
-                      </w:r>
-                      <w:r>
-                        <w:rPr>
-                          <w:rFonts w:ascii="Times New Roman" w:hAnsi="Times New Roman" w:cs="Times New Roman"/>
-                          <w:lang w:val="en-US"/>
-                        </w:rPr>
-                        <w:t>a</w:t>
-                      </w:r>
-                      <w:r>
-                        <w:rPr>
-                          <w:rFonts w:ascii="Times New Roman" w:hAnsi="Times New Roman" w:cs="Times New Roman"/>
-                          <w:lang w:val="en-US"/>
-                        </w:rPr>
-                        <w:t>C</w:t>
-                      </w:r>
-                      <w:r>
-                        <w:rPr>
-                          <w:rFonts w:ascii="Times New Roman" w:hAnsi="Times New Roman" w:cs="Times New Roman"/>
-                          <w:lang w:val="en-US"/>
-                        </w:rPr>
-                        <w:t>el, MITO-7, VDB-2014</w:t>
-                      </w:r>
-                      <w:r>
-                        <w:rPr>
-                          <w:rFonts w:ascii="Times New Roman" w:hAnsi="Times New Roman" w:cs="Times New Roman"/>
-                          <w:lang w:val="en-US"/>
-                        </w:rPr>
-                        <w:t xml:space="preserve">) </w:t>
-                      </w:r>
-                    </w:p>
-                  </w:txbxContent>
-                </v:textbox>
-                <w10:wrap type="square"/>
-              </v:shape>
-            </w:pict>
-          </mc:Fallback>
-        </mc:AlternateContent>
-      </w:r>
-      <w:r>
-        <w:rPr>
-          <w:noProof/>
-          <w:lang w:eastAsia="fr-FR"/>
-        </w:rPr>
-        <mc:AlternateContent>
-          <mc:Choice Requires="wps">
-            <w:drawing>
-              <wp:anchor distT="45720" distB="45720" distL="114300" distR="114300" simplePos="0" relativeHeight="251679744" behindDoc="0" locked="0" layoutInCell="1" allowOverlap="1" wp14:anchorId="1C6EDC72" wp14:editId="551B090B">
+              <wp:anchor distT="45720" distB="45720" distL="114300" distR="114300" simplePos="0" relativeHeight="251679744" behindDoc="0" locked="0" layoutInCell="1" allowOverlap="1" wp14:anchorId="1C6EDC72" wp14:editId="512CE759">
                 <wp:simplePos x="0" y="0"/>
                 <wp:positionH relativeFrom="column">
                   <wp:posOffset>3521710</wp:posOffset>
@@ -2128,7 +1767,7 @@
           </mc:Choice>
           <mc:Fallback>
             <w:pict>
-              <v:shape w14:anchorId="1C6EDC72" id="_x0000_s1033" type="#_x0000_t202" style="position:absolute;margin-left:277.3pt;margin-top:208.65pt;width:221.3pt;height:110.6pt;z-index:251679744;visibility:visible;mso-wrap-style:square;mso-width-percent:0;mso-height-percent:200;mso-wrap-distance-left:9pt;mso-wrap-distance-top:3.6pt;mso-wrap-distance-right:9pt;mso-wrap-distance-bottom:3.6pt;mso-position-horizontal:absolute;mso-position-horizontal-relative:text;mso-position-vertical:absolute;mso-position-vertical-relative:text;mso-width-percent:0;mso-height-percent:200;mso-width-relative:margin;mso-height-relative:margin;v-text-anchor:top" o:gfxdata="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">
+              <v:shape w14:anchorId="1C6EDC72" id="_x0000_s1032" type="#_x0000_t202" style="position:absolute;margin-left:277.3pt;margin-top:208.65pt;width:221.3pt;height:110.6pt;z-index:251679744;visibility:visible;mso-wrap-style:square;mso-width-percent:0;mso-height-percent:200;mso-wrap-distance-left:9pt;mso-wrap-distance-top:3.6pt;mso-wrap-distance-right:9pt;mso-wrap-distance-bottom:3.6pt;mso-position-horizontal:absolute;mso-position-horizontal-relative:text;mso-position-vertical:absolute;mso-position-vertical-relative:text;mso-width-percent:0;mso-height-percent:200;mso-width-relative:margin;mso-height-relative:margin;v-text-anchor:top" o:gfxdata="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">
                 <v:textbox style="mso-fit-shape-to-text:t">
                   <w:txbxContent>
                     <w:p>

</xml_diff>

<commit_message>
Patients do not need at least 2 measurements, redid all the analyses
</commit_message>
<xml_diff>
--- a/study_design.docx
+++ b/study_design.docx
@@ -2,7 +2,10 @@
 <file path=word/document.xml><?xml version="1.0" encoding="utf-8"?>
 <w:document xmlns:wpc="http://schemas.microsoft.com/office/word/2010/wordprocessingCanvas" xmlns:cx="http://schemas.microsoft.com/office/drawing/2014/chartex" xmlns:cx1="http://schemas.microsoft.com/office/drawing/2015/9/8/chartex" xmlns:mc="http://schemas.openxmlformats.org/markup-compatibility/2006" xmlns:o="urn:schemas-microsoft-com:office:office" xmlns:r="http://schemas.openxmlformats.org/officeDocument/2006/relationships" xmlns:m="http://schemas.openxmlformats.org/officeDocument/2006/math" xmlns:v="urn:schemas-microsoft-com:vml" xmlns:wp14="http://schemas.microsoft.com/office/word/2010/wordprocessingDrawing" xmlns:wp="http://schemas.openxmlformats.org/drawingml/2006/wordprocessingDrawing" xmlns:w10="urn:schemas-microsoft-com:office:word" xmlns:w="http://schemas.openxmlformats.org/wordprocessingml/2006/main" xmlns:w14="http://schemas.microsoft.com/office/word/2010/wordml" xmlns:w15="http://schemas.microsoft.com/office/word/2012/wordml" xmlns:w16se="http://schemas.microsoft.com/office/word/2015/wordml/symex" xmlns:wpg="http://schemas.microsoft.com/office/word/2010/wordprocessingGroup" xmlns:wpi="http://schemas.microsoft.com/office/word/2010/wordprocessingInk" xmlns:wne="http://schemas.microsoft.com/office/word/2006/wordml" xmlns:wps="http://schemas.microsoft.com/office/word/2010/wordprocessingShape" mc:Ignorable="w14 w15 w16se wp14">
   <w:body>
-    <w:p/>
+    <w:p>
+      <w:bookmarkStart w:id="0" w:name="_GoBack"/>
+      <w:bookmarkEnd w:id="0"/>
+    </w:p>
     <w:p>
       <w:r>
         <w:rPr>
@@ -1323,713 +1326,7 @@
         <mc:AlternateContent>
           <mc:Choice Requires="wps">
             <w:drawing>
-              <wp:anchor distT="45720" distB="45720" distL="114300" distR="114300" simplePos="0" relativeHeight="251673600" behindDoc="0" locked="0" layoutInCell="1" allowOverlap="1" wp14:anchorId="7371F9AE" wp14:editId="79D15B5E">
-                <wp:simplePos x="0" y="0"/>
-                <wp:positionH relativeFrom="column">
-                  <wp:posOffset>911225</wp:posOffset>
-                </wp:positionH>
-                <wp:positionV relativeFrom="paragraph">
-                  <wp:posOffset>3378291</wp:posOffset>
-                </wp:positionV>
-                <wp:extent cx="2360930" cy="1320800"/>
-                <wp:effectExtent l="0" t="0" r="19685" b="12700"/>
-                <wp:wrapSquare wrapText="bothSides"/>
-                <wp:docPr id="1502922821" name="Zone de texte 2"/>
-                <wp:cNvGraphicFramePr>
-                  <a:graphicFrameLocks xmlns:a="http://schemas.openxmlformats.org/drawingml/2006/main"/>
-                </wp:cNvGraphicFramePr>
-                <a:graphic xmlns:a="http://schemas.openxmlformats.org/drawingml/2006/main">
-                  <a:graphicData uri="http://schemas.microsoft.com/office/word/2010/wordprocessingShape">
-                    <wps:wsp>
-                      <wps:cNvSpPr txBox="1">
-                        <a:spLocks noChangeArrowheads="1"/>
-                      </wps:cNvSpPr>
-                      <wps:spPr bwMode="auto">
-                        <a:xfrm>
-                          <a:off x="0" y="0"/>
-                          <a:ext cx="2360930" cy="1320800"/>
-                        </a:xfrm>
-                        <a:prstGeom prst="rect">
-                          <a:avLst/>
-                        </a:prstGeom>
-                        <a:solidFill>
-                          <a:srgbClr val="FFFFFF"/>
-                        </a:solidFill>
-                        <a:ln w="9525">
-                          <a:solidFill>
-                            <a:srgbClr val="000000"/>
-                          </a:solidFill>
-                          <a:miter lim="800000"/>
-                          <a:headEnd/>
-                          <a:tailEnd/>
-                        </a:ln>
-                      </wps:spPr>
-                      <wps:txbx>
-                        <w:txbxContent>
-                          <w:p>
-                            <w:pPr>
-                              <w:spacing w:after="0"/>
-                              <w:jc w:val="center"/>
-                              <w:rPr>
-                                <w:rFonts w:ascii="Times New Roman" w:hAnsi="Times New Roman" w:cs="Times New Roman"/>
-                                <w:lang w:val="en-US"/>
-                              </w:rPr>
-                            </w:pPr>
-                          </w:p>
-                          <w:p>
-                            <w:pPr>
-                              <w:spacing w:after="0"/>
-                              <w:jc w:val="center"/>
-                              <w:rPr>
-                                <w:rFonts w:ascii="Times New Roman" w:hAnsi="Times New Roman" w:cs="Times New Roman"/>
-                                <w:lang w:val="en-US"/>
-                              </w:rPr>
-                            </w:pPr>
-                          </w:p>
-                          <w:p>
-                            <w:pPr>
-                              <w:spacing w:after="0"/>
-                              <w:jc w:val="center"/>
-                              <w:rPr>
-                                <w:rFonts w:ascii="Times New Roman" w:hAnsi="Times New Roman" w:cs="Times New Roman"/>
-                                <w:lang w:val="en-US"/>
-                              </w:rPr>
-                            </w:pPr>
-                            <w:r>
-                              <w:rPr>
-                                <w:rFonts w:ascii="Times New Roman" w:hAnsi="Times New Roman" w:cs="Times New Roman"/>
-                                <w:lang w:val="en-US"/>
-                              </w:rPr>
-                              <w:t>n = 13 trials</w:t>
-                            </w:r>
-                          </w:p>
-                          <w:p>
-                            <w:pPr>
-                              <w:spacing w:after="0"/>
-                              <w:jc w:val="center"/>
-                              <w:rPr>
-                                <w:rFonts w:ascii="Times New Roman" w:hAnsi="Times New Roman" w:cs="Times New Roman"/>
-                                <w:lang w:val="en-US"/>
-                              </w:rPr>
-                            </w:pPr>
-                            <w:r>
-                              <w:rPr>
-                                <w:rFonts w:ascii="Times New Roman" w:hAnsi="Times New Roman" w:cs="Times New Roman"/>
-                                <w:lang w:val="en-US"/>
-                              </w:rPr>
-                              <w:t xml:space="preserve">N = </w:t>
-                            </w:r>
-                            <w:r>
-                              <w:rPr>
-                                <w:rFonts w:ascii="Times New Roman" w:hAnsi="Times New Roman" w:cs="Times New Roman"/>
-                                <w:lang w:val="en-US"/>
-                              </w:rPr>
-                              <w:t>7,933</w:t>
-                            </w:r>
-                            <w:r>
-                              <w:rPr>
-                                <w:rFonts w:ascii="Times New Roman" w:hAnsi="Times New Roman" w:cs="Times New Roman"/>
-                                <w:lang w:val="en-US"/>
-                              </w:rPr>
-                              <w:t xml:space="preserve"> patients</w:t>
-                            </w:r>
-                          </w:p>
-                          <w:p>
-                            <w:pPr>
-                              <w:jc w:val="center"/>
-                              <w:rPr>
-                                <w:rFonts w:ascii="Times New Roman" w:hAnsi="Times New Roman" w:cs="Times New Roman"/>
-                                <w:lang w:val="en-US"/>
-                              </w:rPr>
-                            </w:pPr>
-                            <w:r>
-                              <w:rPr>
-                                <w:rFonts w:ascii="Times New Roman" w:hAnsi="Times New Roman" w:cs="Times New Roman"/>
-                                <w:lang w:val="en-US"/>
-                              </w:rPr>
-                              <w:t>47</w:t>
-                            </w:r>
-                            <w:r>
-                              <w:rPr>
-                                <w:rFonts w:ascii="Times New Roman" w:hAnsi="Times New Roman" w:cs="Times New Roman"/>
-                                <w:lang w:val="en-US"/>
-                              </w:rPr>
-                              <w:t>,256</w:t>
-                            </w:r>
-                            <w:r>
-                              <w:rPr>
-                                <w:rFonts w:ascii="Times New Roman" w:hAnsi="Times New Roman" w:cs="Times New Roman"/>
-                                <w:lang w:val="en-US"/>
-                              </w:rPr>
-                              <w:t xml:space="preserve"> measures</w:t>
-                            </w:r>
-                          </w:p>
-                        </w:txbxContent>
-                      </wps:txbx>
-                      <wps:bodyPr rot="0" vert="horz" wrap="square" lIns="91440" tIns="45720" rIns="91440" bIns="45720" anchor="t" anchorCtr="0">
-                        <a:noAutofit/>
-                      </wps:bodyPr>
-                    </wps:wsp>
-                  </a:graphicData>
-                </a:graphic>
-                <wp14:sizeRelH relativeFrom="margin">
-                  <wp14:pctWidth>40000</wp14:pctWidth>
-                </wp14:sizeRelH>
-                <wp14:sizeRelV relativeFrom="margin">
-                  <wp14:pctHeight>0</wp14:pctHeight>
-                </wp14:sizeRelV>
-              </wp:anchor>
-            </w:drawing>
-          </mc:Choice>
-          <mc:Fallback>
-            <w:pict>
-              <v:shape w14:anchorId="7371F9AE" id="_x0000_s1031" type="#_x0000_t202" style="position:absolute;margin-left:71.75pt;margin-top:266pt;width:185.9pt;height:104pt;z-index:251673600;visibility:visible;mso-wrap-style:square;mso-width-percent:400;mso-height-percent:0;mso-wrap-distance-left:9pt;mso-wrap-distance-top:3.6pt;mso-wrap-distance-right:9pt;mso-wrap-distance-bottom:3.6pt;mso-position-horizontal:absolute;mso-position-horizontal-relative:text;mso-position-vertical:absolute;mso-position-vertical-relative:text;mso-width-percent:400;mso-height-percent:0;mso-width-relative:margin;mso-height-relative:margin;v-text-anchor:top" o:gfxdata="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">
-                <v:textbox>
-                  <w:txbxContent>
-                    <w:p>
-                      <w:pPr>
-                        <w:spacing w:after="0"/>
-                        <w:jc w:val="center"/>
-                        <w:rPr>
-                          <w:rFonts w:ascii="Times New Roman" w:hAnsi="Times New Roman" w:cs="Times New Roman"/>
-                          <w:lang w:val="en-US"/>
-                        </w:rPr>
-                      </w:pPr>
-                    </w:p>
-                    <w:p>
-                      <w:pPr>
-                        <w:spacing w:after="0"/>
-                        <w:jc w:val="center"/>
-                        <w:rPr>
-                          <w:rFonts w:ascii="Times New Roman" w:hAnsi="Times New Roman" w:cs="Times New Roman"/>
-                          <w:lang w:val="en-US"/>
-                        </w:rPr>
-                      </w:pPr>
-                    </w:p>
-                    <w:p>
-                      <w:pPr>
-                        <w:spacing w:after="0"/>
-                        <w:jc w:val="center"/>
-                        <w:rPr>
-                          <w:rFonts w:ascii="Times New Roman" w:hAnsi="Times New Roman" w:cs="Times New Roman"/>
-                          <w:lang w:val="en-US"/>
-                        </w:rPr>
-                      </w:pPr>
-                      <w:r>
-                        <w:rPr>
-                          <w:rFonts w:ascii="Times New Roman" w:hAnsi="Times New Roman" w:cs="Times New Roman"/>
-                          <w:lang w:val="en-US"/>
-                        </w:rPr>
-                        <w:t>n = 13 trials</w:t>
-                      </w:r>
-                    </w:p>
-                    <w:p>
-                      <w:pPr>
-                        <w:spacing w:after="0"/>
-                        <w:jc w:val="center"/>
-                        <w:rPr>
-                          <w:rFonts w:ascii="Times New Roman" w:hAnsi="Times New Roman" w:cs="Times New Roman"/>
-                          <w:lang w:val="en-US"/>
-                        </w:rPr>
-                      </w:pPr>
-                      <w:r>
-                        <w:rPr>
-                          <w:rFonts w:ascii="Times New Roman" w:hAnsi="Times New Roman" w:cs="Times New Roman"/>
-                          <w:lang w:val="en-US"/>
-                        </w:rPr>
-                        <w:t xml:space="preserve">N = </w:t>
-                      </w:r>
-                      <w:r>
-                        <w:rPr>
-                          <w:rFonts w:ascii="Times New Roman" w:hAnsi="Times New Roman" w:cs="Times New Roman"/>
-                          <w:lang w:val="en-US"/>
-                        </w:rPr>
-                        <w:t>7,933</w:t>
-                      </w:r>
-                      <w:r>
-                        <w:rPr>
-                          <w:rFonts w:ascii="Times New Roman" w:hAnsi="Times New Roman" w:cs="Times New Roman"/>
-                          <w:lang w:val="en-US"/>
-                        </w:rPr>
-                        <w:t xml:space="preserve"> patients</w:t>
-                      </w:r>
-                    </w:p>
-                    <w:p>
-                      <w:pPr>
-                        <w:jc w:val="center"/>
-                        <w:rPr>
-                          <w:rFonts w:ascii="Times New Roman" w:hAnsi="Times New Roman" w:cs="Times New Roman"/>
-                          <w:lang w:val="en-US"/>
-                        </w:rPr>
-                      </w:pPr>
-                      <w:r>
-                        <w:rPr>
-                          <w:rFonts w:ascii="Times New Roman" w:hAnsi="Times New Roman" w:cs="Times New Roman"/>
-                          <w:lang w:val="en-US"/>
-                        </w:rPr>
-                        <w:t>47</w:t>
-                      </w:r>
-                      <w:r>
-                        <w:rPr>
-                          <w:rFonts w:ascii="Times New Roman" w:hAnsi="Times New Roman" w:cs="Times New Roman"/>
-                          <w:lang w:val="en-US"/>
-                        </w:rPr>
-                        <w:t>,256</w:t>
-                      </w:r>
-                      <w:r>
-                        <w:rPr>
-                          <w:rFonts w:ascii="Times New Roman" w:hAnsi="Times New Roman" w:cs="Times New Roman"/>
-                          <w:lang w:val="en-US"/>
-                        </w:rPr>
-                        <w:t xml:space="preserve"> measures</w:t>
-                      </w:r>
-                    </w:p>
-                  </w:txbxContent>
-                </v:textbox>
-                <w10:wrap type="square"/>
-              </v:shape>
-            </w:pict>
-          </mc:Fallback>
-        </mc:AlternateContent>
-      </w:r>
-      <w:bookmarkStart w:id="0" w:name="_GoBack"/>
-      <w:bookmarkEnd w:id="0"/>
-      <w:r>
-        <w:rPr>
-          <w:noProof/>
-          <w:lang w:eastAsia="fr-FR"/>
-        </w:rPr>
-        <mc:AlternateContent>
-          <mc:Choice Requires="wps">
-            <w:drawing>
-              <wp:anchor distT="45720" distB="45720" distL="114300" distR="114300" simplePos="0" relativeHeight="251679744" behindDoc="0" locked="0" layoutInCell="1" allowOverlap="1" wp14:anchorId="1C6EDC72" wp14:editId="512CE759">
-                <wp:simplePos x="0" y="0"/>
-                <wp:positionH relativeFrom="column">
-                  <wp:posOffset>3521710</wp:posOffset>
-                </wp:positionH>
-                <wp:positionV relativeFrom="paragraph">
-                  <wp:posOffset>2649855</wp:posOffset>
-                </wp:positionV>
-                <wp:extent cx="2810510" cy="1404620"/>
-                <wp:effectExtent l="0" t="0" r="27940" b="22860"/>
-                <wp:wrapSquare wrapText="bothSides"/>
-                <wp:docPr id="1168583434" name="Zone de texte 2"/>
-                <wp:cNvGraphicFramePr>
-                  <a:graphicFrameLocks xmlns:a="http://schemas.openxmlformats.org/drawingml/2006/main"/>
-                </wp:cNvGraphicFramePr>
-                <a:graphic xmlns:a="http://schemas.openxmlformats.org/drawingml/2006/main">
-                  <a:graphicData uri="http://schemas.microsoft.com/office/word/2010/wordprocessingShape">
-                    <wps:wsp>
-                      <wps:cNvSpPr txBox="1">
-                        <a:spLocks noChangeArrowheads="1"/>
-                      </wps:cNvSpPr>
-                      <wps:spPr bwMode="auto">
-                        <a:xfrm>
-                          <a:off x="0" y="0"/>
-                          <a:ext cx="2810510" cy="1404620"/>
-                        </a:xfrm>
-                        <a:prstGeom prst="rect">
-                          <a:avLst/>
-                        </a:prstGeom>
-                        <a:solidFill>
-                          <a:srgbClr val="FFFFFF"/>
-                        </a:solidFill>
-                        <a:ln w="9525">
-                          <a:solidFill>
-                            <a:srgbClr val="000000"/>
-                          </a:solidFill>
-                          <a:miter lim="800000"/>
-                          <a:headEnd/>
-                          <a:tailEnd/>
-                        </a:ln>
-                      </wps:spPr>
-                      <wps:txbx>
-                        <w:txbxContent>
-                          <w:p>
-                            <w:pPr>
-                              <w:spacing w:after="0"/>
-                              <w:jc w:val="center"/>
-                              <w:rPr>
-                                <w:rFonts w:ascii="Times New Roman" w:hAnsi="Times New Roman" w:cs="Times New Roman"/>
-                                <w:lang w:val="en-US"/>
-                              </w:rPr>
-                            </w:pPr>
-                            <w:r>
-                              <w:rPr>
-                                <w:rFonts w:ascii="Times New Roman" w:hAnsi="Times New Roman" w:cs="Times New Roman"/>
-                                <w:lang w:val="en-US"/>
-                              </w:rPr>
-                              <w:t>P</w:t>
-                            </w:r>
-                            <w:r>
-                              <w:rPr>
-                                <w:rFonts w:ascii="Times New Roman" w:hAnsi="Times New Roman" w:cs="Times New Roman"/>
-                                <w:lang w:val="en-US"/>
-                              </w:rPr>
-                              <w:t xml:space="preserve">atients with </w:t>
-                            </w:r>
-                            <w:r>
-                              <w:rPr>
-                                <w:rFonts w:ascii="Times New Roman" w:hAnsi="Times New Roman" w:cs="Times New Roman"/>
-                                <w:lang w:val="en-US"/>
-                              </w:rPr>
-                              <w:t xml:space="preserve">less than </w:t>
-                            </w:r>
-                            <w:r>
-                              <w:rPr>
-                                <w:rFonts w:ascii="Times New Roman" w:hAnsi="Times New Roman" w:cs="Times New Roman"/>
-                                <w:lang w:val="en-US"/>
-                              </w:rPr>
-                              <w:t>two</w:t>
-                            </w:r>
-                            <w:r>
-                              <w:rPr>
-                                <w:rFonts w:ascii="Times New Roman" w:hAnsi="Times New Roman" w:cs="Times New Roman"/>
-                                <w:lang w:val="en-US"/>
-                              </w:rPr>
-                              <w:t xml:space="preserve"> CA-125 measures</w:t>
-                            </w:r>
-                          </w:p>
-                          <w:p>
-                            <w:pPr>
-                              <w:jc w:val="center"/>
-                              <w:rPr>
-                                <w:rFonts w:ascii="Times New Roman" w:hAnsi="Times New Roman" w:cs="Times New Roman"/>
-                                <w:lang w:val="en-US"/>
-                              </w:rPr>
-                            </w:pPr>
-                            <w:r>
-                              <w:rPr>
-                                <w:rFonts w:ascii="Times New Roman" w:hAnsi="Times New Roman" w:cs="Times New Roman"/>
-                                <w:lang w:val="en-US"/>
-                              </w:rPr>
-                              <w:t>N</w:t>
-                            </w:r>
-                            <w:r>
-                              <w:rPr>
-                                <w:rFonts w:ascii="Times New Roman" w:hAnsi="Times New Roman" w:cs="Times New Roman"/>
-                                <w:lang w:val="en-US"/>
-                              </w:rPr>
-                              <w:t xml:space="preserve"> </w:t>
-                            </w:r>
-                            <w:r>
-                              <w:rPr>
-                                <w:rFonts w:ascii="Times New Roman" w:hAnsi="Times New Roman" w:cs="Times New Roman"/>
-                                <w:lang w:val="en-US"/>
-                              </w:rPr>
-                              <w:t>=</w:t>
-                            </w:r>
-                            <w:r>
-                              <w:rPr>
-                                <w:rFonts w:ascii="Times New Roman" w:hAnsi="Times New Roman" w:cs="Times New Roman"/>
-                                <w:lang w:val="en-US"/>
-                              </w:rPr>
-                              <w:t xml:space="preserve"> </w:t>
-                            </w:r>
-                            <w:r>
-                              <w:rPr>
-                                <w:rFonts w:ascii="Times New Roman" w:hAnsi="Times New Roman" w:cs="Times New Roman"/>
-                                <w:lang w:val="en-US"/>
-                              </w:rPr>
-                              <w:t>23</w:t>
-                            </w:r>
-                            <w:r>
-                              <w:rPr>
-                                <w:rFonts w:ascii="Times New Roman" w:hAnsi="Times New Roman" w:cs="Times New Roman"/>
-                                <w:lang w:val="en-US"/>
-                              </w:rPr>
-                              <w:t>0</w:t>
-                            </w:r>
-                            <w:r>
-                              <w:rPr>
-                                <w:rFonts w:ascii="Times New Roman" w:hAnsi="Times New Roman" w:cs="Times New Roman"/>
-                                <w:lang w:val="en-US"/>
-                              </w:rPr>
-                              <w:t xml:space="preserve"> patients</w:t>
-                            </w:r>
-                          </w:p>
-                        </w:txbxContent>
-                      </wps:txbx>
-                      <wps:bodyPr rot="0" vert="horz" wrap="square" lIns="91440" tIns="45720" rIns="91440" bIns="45720" anchor="t" anchorCtr="0">
-                        <a:spAutoFit/>
-                      </wps:bodyPr>
-                    </wps:wsp>
-                  </a:graphicData>
-                </a:graphic>
-                <wp14:sizeRelH relativeFrom="margin">
-                  <wp14:pctWidth>0</wp14:pctWidth>
-                </wp14:sizeRelH>
-                <wp14:sizeRelV relativeFrom="margin">
-                  <wp14:pctHeight>20000</wp14:pctHeight>
-                </wp14:sizeRelV>
-              </wp:anchor>
-            </w:drawing>
-          </mc:Choice>
-          <mc:Fallback>
-            <w:pict>
-              <v:shape w14:anchorId="1C6EDC72" id="_x0000_s1032" type="#_x0000_t202" style="position:absolute;margin-left:277.3pt;margin-top:208.65pt;width:221.3pt;height:110.6pt;z-index:251679744;visibility:visible;mso-wrap-style:square;mso-width-percent:0;mso-height-percent:200;mso-wrap-distance-left:9pt;mso-wrap-distance-top:3.6pt;mso-wrap-distance-right:9pt;mso-wrap-distance-bottom:3.6pt;mso-position-horizontal:absolute;mso-position-horizontal-relative:text;mso-position-vertical:absolute;mso-position-vertical-relative:text;mso-width-percent:0;mso-height-percent:200;mso-width-relative:margin;mso-height-relative:margin;v-text-anchor:top" o:gfxdata="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">
-                <v:textbox style="mso-fit-shape-to-text:t">
-                  <w:txbxContent>
-                    <w:p>
-                      <w:pPr>
-                        <w:spacing w:after="0"/>
-                        <w:jc w:val="center"/>
-                        <w:rPr>
-                          <w:rFonts w:ascii="Times New Roman" w:hAnsi="Times New Roman" w:cs="Times New Roman"/>
-                          <w:lang w:val="en-US"/>
-                        </w:rPr>
-                      </w:pPr>
-                      <w:r>
-                        <w:rPr>
-                          <w:rFonts w:ascii="Times New Roman" w:hAnsi="Times New Roman" w:cs="Times New Roman"/>
-                          <w:lang w:val="en-US"/>
-                        </w:rPr>
-                        <w:t>P</w:t>
-                      </w:r>
-                      <w:r>
-                        <w:rPr>
-                          <w:rFonts w:ascii="Times New Roman" w:hAnsi="Times New Roman" w:cs="Times New Roman"/>
-                          <w:lang w:val="en-US"/>
-                        </w:rPr>
-                        <w:t xml:space="preserve">atients with </w:t>
-                      </w:r>
-                      <w:r>
-                        <w:rPr>
-                          <w:rFonts w:ascii="Times New Roman" w:hAnsi="Times New Roman" w:cs="Times New Roman"/>
-                          <w:lang w:val="en-US"/>
-                        </w:rPr>
-                        <w:t xml:space="preserve">less than </w:t>
-                      </w:r>
-                      <w:r>
-                        <w:rPr>
-                          <w:rFonts w:ascii="Times New Roman" w:hAnsi="Times New Roman" w:cs="Times New Roman"/>
-                          <w:lang w:val="en-US"/>
-                        </w:rPr>
-                        <w:t>two</w:t>
-                      </w:r>
-                      <w:r>
-                        <w:rPr>
-                          <w:rFonts w:ascii="Times New Roman" w:hAnsi="Times New Roman" w:cs="Times New Roman"/>
-                          <w:lang w:val="en-US"/>
-                        </w:rPr>
-                        <w:t xml:space="preserve"> CA-125 measures</w:t>
-                      </w:r>
-                    </w:p>
-                    <w:p>
-                      <w:pPr>
-                        <w:jc w:val="center"/>
-                        <w:rPr>
-                          <w:rFonts w:ascii="Times New Roman" w:hAnsi="Times New Roman" w:cs="Times New Roman"/>
-                          <w:lang w:val="en-US"/>
-                        </w:rPr>
-                      </w:pPr>
-                      <w:r>
-                        <w:rPr>
-                          <w:rFonts w:ascii="Times New Roman" w:hAnsi="Times New Roman" w:cs="Times New Roman"/>
-                          <w:lang w:val="en-US"/>
-                        </w:rPr>
-                        <w:t>N</w:t>
-                      </w:r>
-                      <w:r>
-                        <w:rPr>
-                          <w:rFonts w:ascii="Times New Roman" w:hAnsi="Times New Roman" w:cs="Times New Roman"/>
-                          <w:lang w:val="en-US"/>
-                        </w:rPr>
-                        <w:t xml:space="preserve"> </w:t>
-                      </w:r>
-                      <w:r>
-                        <w:rPr>
-                          <w:rFonts w:ascii="Times New Roman" w:hAnsi="Times New Roman" w:cs="Times New Roman"/>
-                          <w:lang w:val="en-US"/>
-                        </w:rPr>
-                        <w:t>=</w:t>
-                      </w:r>
-                      <w:r>
-                        <w:rPr>
-                          <w:rFonts w:ascii="Times New Roman" w:hAnsi="Times New Roman" w:cs="Times New Roman"/>
-                          <w:lang w:val="en-US"/>
-                        </w:rPr>
-                        <w:t xml:space="preserve"> </w:t>
-                      </w:r>
-                      <w:r>
-                        <w:rPr>
-                          <w:rFonts w:ascii="Times New Roman" w:hAnsi="Times New Roman" w:cs="Times New Roman"/>
-                          <w:lang w:val="en-US"/>
-                        </w:rPr>
-                        <w:t>23</w:t>
-                      </w:r>
-                      <w:r>
-                        <w:rPr>
-                          <w:rFonts w:ascii="Times New Roman" w:hAnsi="Times New Roman" w:cs="Times New Roman"/>
-                          <w:lang w:val="en-US"/>
-                        </w:rPr>
-                        <w:t>0</w:t>
-                      </w:r>
-                      <w:r>
-                        <w:rPr>
-                          <w:rFonts w:ascii="Times New Roman" w:hAnsi="Times New Roman" w:cs="Times New Roman"/>
-                          <w:lang w:val="en-US"/>
-                        </w:rPr>
-                        <w:t xml:space="preserve"> patients</w:t>
-                      </w:r>
-                    </w:p>
-                  </w:txbxContent>
-                </v:textbox>
-                <w10:wrap type="square"/>
-              </v:shape>
-            </w:pict>
-          </mc:Fallback>
-        </mc:AlternateContent>
-      </w:r>
-      <w:r>
-        <w:rPr>
-          <w:noProof/>
-          <w:lang w:eastAsia="fr-FR"/>
-        </w:rPr>
-        <mc:AlternateContent>
-          <mc:Choice Requires="wps">
-            <w:drawing>
-              <wp:anchor distT="0" distB="0" distL="114300" distR="114300" simplePos="0" relativeHeight="251677696" behindDoc="0" locked="0" layoutInCell="1" allowOverlap="1" wp14:anchorId="5EF86310" wp14:editId="5396A3E9">
-                <wp:simplePos x="0" y="0"/>
-                <wp:positionH relativeFrom="column">
-                  <wp:posOffset>2052955</wp:posOffset>
-                </wp:positionH>
-                <wp:positionV relativeFrom="paragraph">
-                  <wp:posOffset>2990850</wp:posOffset>
-                </wp:positionV>
-                <wp:extent cx="1468755" cy="45085"/>
-                <wp:effectExtent l="0" t="38100" r="36195" b="88265"/>
-                <wp:wrapNone/>
-                <wp:docPr id="2069849188" name="Connecteur droit avec flèche 4"/>
-                <wp:cNvGraphicFramePr/>
-                <a:graphic xmlns:a="http://schemas.openxmlformats.org/drawingml/2006/main">
-                  <a:graphicData uri="http://schemas.microsoft.com/office/word/2010/wordprocessingShape">
-                    <wps:wsp>
-                      <wps:cNvCnPr/>
-                      <wps:spPr>
-                        <a:xfrm>
-                          <a:off x="0" y="0"/>
-                          <a:ext cx="1468755" cy="45085"/>
-                        </a:xfrm>
-                        <a:prstGeom prst="straightConnector1">
-                          <a:avLst/>
-                        </a:prstGeom>
-                        <a:ln>
-                          <a:tailEnd type="triangle"/>
-                        </a:ln>
-                      </wps:spPr>
-                      <wps:style>
-                        <a:lnRef idx="1">
-                          <a:schemeClr val="dk1"/>
-                        </a:lnRef>
-                        <a:fillRef idx="0">
-                          <a:schemeClr val="dk1"/>
-                        </a:fillRef>
-                        <a:effectRef idx="0">
-                          <a:schemeClr val="dk1"/>
-                        </a:effectRef>
-                        <a:fontRef idx="minor">
-                          <a:schemeClr val="tx1"/>
-                        </a:fontRef>
-                      </wps:style>
-                      <wps:bodyPr/>
-                    </wps:wsp>
-                  </a:graphicData>
-                </a:graphic>
-                <wp14:sizeRelH relativeFrom="margin">
-                  <wp14:pctWidth>0</wp14:pctWidth>
-                </wp14:sizeRelH>
-                <wp14:sizeRelV relativeFrom="margin">
-                  <wp14:pctHeight>0</wp14:pctHeight>
-                </wp14:sizeRelV>
-              </wp:anchor>
-            </w:drawing>
-          </mc:Choice>
-          <mc:Fallback>
-            <w:pict>
-              <v:shape w14:anchorId="009C604F" id="Connecteur droit avec flèche 4" o:spid="_x0000_s1026" type="#_x0000_t32" style="position:absolute;margin-left:161.65pt;margin-top:235.5pt;width:115.65pt;height:3.55pt;z-index:251677696;visibility:visible;mso-wrap-style:square;mso-width-percent:0;mso-height-percent:0;mso-wrap-distance-left:9pt;mso-wrap-distance-top:0;mso-wrap-distance-right:9pt;mso-wrap-distance-bottom:0;mso-position-horizontal:absolute;mso-position-horizontal-relative:text;mso-position-vertical:absolute;mso-position-vertical-relative:text;mso-width-percent:0;mso-height-percent:0;mso-width-relative:margin;mso-height-relative:margin" o:gfxdata="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" strokecolor="black [3200]" strokeweight=".5pt">
-                <v:stroke endarrow="block" joinstyle="miter"/>
-              </v:shape>
-            </w:pict>
-          </mc:Fallback>
-        </mc:AlternateContent>
-      </w:r>
-      <w:r>
-        <w:rPr>
-          <w:noProof/>
-          <w:lang w:eastAsia="fr-FR"/>
-        </w:rPr>
-        <mc:AlternateContent>
-          <mc:Choice Requires="wps">
-            <w:drawing>
-              <wp:anchor distT="0" distB="0" distL="114300" distR="114300" simplePos="0" relativeHeight="251680768" behindDoc="0" locked="0" layoutInCell="1" allowOverlap="1" wp14:anchorId="7AD3D0D4" wp14:editId="2AEA77C1">
-                <wp:simplePos x="0" y="0"/>
-                <wp:positionH relativeFrom="column">
-                  <wp:posOffset>2029460</wp:posOffset>
-                </wp:positionH>
-                <wp:positionV relativeFrom="paragraph">
-                  <wp:posOffset>2810510</wp:posOffset>
-                </wp:positionV>
-                <wp:extent cx="0" cy="575310"/>
-                <wp:effectExtent l="76200" t="0" r="57150" b="53340"/>
-                <wp:wrapNone/>
-                <wp:docPr id="795753588" name="Connecteur droit avec flèche 6"/>
-                <wp:cNvGraphicFramePr/>
-                <a:graphic xmlns:a="http://schemas.openxmlformats.org/drawingml/2006/main">
-                  <a:graphicData uri="http://schemas.microsoft.com/office/word/2010/wordprocessingShape">
-                    <wps:wsp>
-                      <wps:cNvCnPr/>
-                      <wps:spPr>
-                        <a:xfrm>
-                          <a:off x="0" y="0"/>
-                          <a:ext cx="0" cy="575310"/>
-                        </a:xfrm>
-                        <a:prstGeom prst="straightConnector1">
-                          <a:avLst/>
-                        </a:prstGeom>
-                        <a:ln>
-                          <a:tailEnd type="triangle"/>
-                        </a:ln>
-                      </wps:spPr>
-                      <wps:style>
-                        <a:lnRef idx="1">
-                          <a:schemeClr val="dk1"/>
-                        </a:lnRef>
-                        <a:fillRef idx="0">
-                          <a:schemeClr val="dk1"/>
-                        </a:fillRef>
-                        <a:effectRef idx="0">
-                          <a:schemeClr val="dk1"/>
-                        </a:effectRef>
-                        <a:fontRef idx="minor">
-                          <a:schemeClr val="tx1"/>
-                        </a:fontRef>
-                      </wps:style>
-                      <wps:bodyPr/>
-                    </wps:wsp>
-                  </a:graphicData>
-                </a:graphic>
-              </wp:anchor>
-            </w:drawing>
-          </mc:Choice>
-          <mc:Fallback>
-            <w:pict>
-              <v:shape w14:anchorId="583FAB74" id="Connecteur droit avec flèche 6" o:spid="_x0000_s1026" type="#_x0000_t32" style="position:absolute;margin-left:159.8pt;margin-top:221.3pt;width:0;height:45.3pt;z-index:251680768;visibility:visible;mso-wrap-style:square;mso-wrap-distance-left:9pt;mso-wrap-distance-top:0;mso-wrap-distance-right:9pt;mso-wrap-distance-bottom:0;mso-position-horizontal:absolute;mso-position-horizontal-relative:text;mso-position-vertical:absolute;mso-position-vertical-relative:text" o:gfxdata="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" strokecolor="black [3200]" strokeweight=".5pt">
-                <v:stroke endarrow="block" joinstyle="miter"/>
-              </v:shape>
-            </w:pict>
-          </mc:Fallback>
-        </mc:AlternateContent>
-      </w:r>
-      <w:r>
-        <w:rPr>
-          <w:noProof/>
-          <w:lang w:eastAsia="fr-FR"/>
-        </w:rPr>
-        <mc:AlternateContent>
-          <mc:Choice Requires="wps">
-            <w:drawing>
-              <wp:anchor distT="45720" distB="45720" distL="114300" distR="114300" simplePos="0" relativeHeight="251667456" behindDoc="0" locked="0" layoutInCell="1" allowOverlap="1" wp14:anchorId="6F42DAB6" wp14:editId="14AEEBF7">
+              <wp:anchor distT="45720" distB="45720" distL="114300" distR="114300" simplePos="0" relativeHeight="251667456" behindDoc="0" locked="0" layoutInCell="1" allowOverlap="1" wp14:anchorId="6F42DAB6" wp14:editId="2E962A42">
                 <wp:simplePos x="0" y="0"/>
                 <wp:positionH relativeFrom="column">
                   <wp:posOffset>920115</wp:posOffset>
@@ -2119,7 +1416,13 @@
                               <w:rPr>
                                 <w:rFonts w:ascii="Times New Roman" w:hAnsi="Times New Roman" w:cs="Times New Roman"/>
                               </w:rPr>
-                              <w:t>163 patients</w:t>
+                              <w:t xml:space="preserve">156 </w:t>
+                            </w:r>
+                            <w:r>
+                              <w:rPr>
+                                <w:rFonts w:ascii="Times New Roman" w:hAnsi="Times New Roman" w:cs="Times New Roman"/>
+                              </w:rPr>
+                              <w:t>patients</w:t>
                             </w:r>
                           </w:p>
                           <w:p>
@@ -2150,7 +1453,21 @@
                                 <w:rFonts w:ascii="Times New Roman" w:hAnsi="Times New Roman" w:cs="Times New Roman"/>
                                 <w:lang w:val="en-US"/>
                               </w:rPr>
-                              <w:t>463 measures*</w:t>
+                              <w:t>44</w:t>
+                            </w:r>
+                            <w:r>
+                              <w:rPr>
+                                <w:rFonts w:ascii="Times New Roman" w:hAnsi="Times New Roman" w:cs="Times New Roman"/>
+                                <w:lang w:val="en-US"/>
+                              </w:rPr>
+                              <w:t>1</w:t>
+                            </w:r>
+                            <w:r>
+                              <w:rPr>
+                                <w:rFonts w:ascii="Times New Roman" w:hAnsi="Times New Roman" w:cs="Times New Roman"/>
+                                <w:lang w:val="en-US"/>
+                              </w:rPr>
+                              <w:t xml:space="preserve"> measures*</w:t>
                             </w:r>
                           </w:p>
                           <w:p>
@@ -2180,7 +1497,11 @@
           </mc:Choice>
           <mc:Fallback>
             <w:pict>
-              <v:shape w14:anchorId="6F42DAB6" id="_x0000_s1034" type="#_x0000_t202" style="position:absolute;margin-left:72.45pt;margin-top:117.3pt;width:185.9pt;height:104pt;z-index:251667456;visibility:visible;mso-wrap-style:square;mso-width-percent:400;mso-height-percent:0;mso-wrap-distance-left:9pt;mso-wrap-distance-top:3.6pt;mso-wrap-distance-right:9pt;mso-wrap-distance-bottom:3.6pt;mso-position-horizontal:absolute;mso-position-horizontal-relative:text;mso-position-vertical:absolute;mso-position-vertical-relative:text;mso-width-percent:400;mso-height-percent:0;mso-width-relative:margin;mso-height-relative:margin;v-text-anchor:top" o:gfxdata="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">
+              <v:shapetype w14:anchorId="6F42DAB6" id="_x0000_t202" coordsize="21600,21600" o:spt="202" path="m,l,21600r21600,l21600,xe">
+                <v:stroke joinstyle="miter"/>
+                <v:path gradientshapeok="t" o:connecttype="rect"/>
+              </v:shapetype>
+              <v:shape id="_x0000_s1031" type="#_x0000_t202" style="position:absolute;margin-left:72.45pt;margin-top:117.3pt;width:185.9pt;height:104pt;z-index:251667456;visibility:visible;mso-wrap-style:square;mso-width-percent:400;mso-height-percent:0;mso-wrap-distance-left:9pt;mso-wrap-distance-top:3.6pt;mso-wrap-distance-right:9pt;mso-wrap-distance-bottom:3.6pt;mso-position-horizontal:absolute;mso-position-horizontal-relative:text;mso-position-vertical:absolute;mso-position-vertical-relative:text;mso-width-percent:400;mso-height-percent:0;mso-width-relative:margin;mso-height-relative:margin;v-text-anchor:top" o:gfxdata="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">
                 <v:textbox>
                   <w:txbxContent>
                     <w:p>
@@ -2230,7 +1551,13 @@
                         <w:rPr>
                           <w:rFonts w:ascii="Times New Roman" w:hAnsi="Times New Roman" w:cs="Times New Roman"/>
                         </w:rPr>
-                        <w:t>163 patients</w:t>
+                        <w:t xml:space="preserve">156 </w:t>
+                      </w:r>
+                      <w:r>
+                        <w:rPr>
+                          <w:rFonts w:ascii="Times New Roman" w:hAnsi="Times New Roman" w:cs="Times New Roman"/>
+                        </w:rPr>
+                        <w:t>patients</w:t>
                       </w:r>
                     </w:p>
                     <w:p>
@@ -2261,7 +1588,21 @@
                           <w:rFonts w:ascii="Times New Roman" w:hAnsi="Times New Roman" w:cs="Times New Roman"/>
                           <w:lang w:val="en-US"/>
                         </w:rPr>
-                        <w:t>463 measures*</w:t>
+                        <w:t>44</w:t>
+                      </w:r>
+                      <w:r>
+                        <w:rPr>
+                          <w:rFonts w:ascii="Times New Roman" w:hAnsi="Times New Roman" w:cs="Times New Roman"/>
+                          <w:lang w:val="en-US"/>
+                        </w:rPr>
+                        <w:t>1</w:t>
+                      </w:r>
+                      <w:r>
+                        <w:rPr>
+                          <w:rFonts w:ascii="Times New Roman" w:hAnsi="Times New Roman" w:cs="Times New Roman"/>
+                          <w:lang w:val="en-US"/>
+                        </w:rPr>
+                        <w:t xml:space="preserve"> measures*</w:t>
                       </w:r>
                     </w:p>
                     <w:p>
@@ -2507,7 +1848,21 @@
                                 <w:rFonts w:ascii="Times New Roman" w:hAnsi="Times New Roman" w:cs="Times New Roman"/>
                                 <w:lang w:val="en-US"/>
                               </w:rPr>
-                              <w:t>elay between surgery and treatment inferior to 7 days</w:t>
+                              <w:t xml:space="preserve">elay between surgery and </w:t>
+                            </w:r>
+                            <w:r>
+                              <w:rPr>
+                                <w:rFonts w:ascii="Times New Roman" w:hAnsi="Times New Roman" w:cs="Times New Roman"/>
+                                <w:lang w:val="en-US"/>
+                              </w:rPr>
+                              <w:t>first measure</w:t>
+                            </w:r>
+                            <w:r>
+                              <w:rPr>
+                                <w:rFonts w:ascii="Times New Roman" w:hAnsi="Times New Roman" w:cs="Times New Roman"/>
+                                <w:lang w:val="en-US"/>
+                              </w:rPr>
+                              <w:t xml:space="preserve"> inferior to 7 days</w:t>
                             </w:r>
                             <w:r>
                               <w:rPr>
@@ -2558,7 +1913,14 @@
                                 <w:rFonts w:ascii="Times New Roman" w:hAnsi="Times New Roman" w:cs="Times New Roman"/>
                                 <w:lang w:val="en-US"/>
                               </w:rPr>
-                              <w:t>53 patients</w:t>
+                              <w:t>63</w:t>
+                            </w:r>
+                            <w:r>
+                              <w:rPr>
+                                <w:rFonts w:ascii="Times New Roman" w:hAnsi="Times New Roman" w:cs="Times New Roman"/>
+                                <w:lang w:val="en-US"/>
+                              </w:rPr>
+                              <w:t xml:space="preserve"> patients</w:t>
                             </w:r>
                           </w:p>
                         </w:txbxContent>
@@ -2580,7 +1942,7 @@
           </mc:Choice>
           <mc:Fallback>
             <w:pict>
-              <v:shape w14:anchorId="72B96A99" id="_x0000_s1036" type="#_x0000_t202" style="position:absolute;margin-left:279.95pt;margin-top:69.5pt;width:221.3pt;height:110.6pt;z-index:251665408;visibility:visible;mso-wrap-style:square;mso-width-percent:0;mso-height-percent:200;mso-wrap-distance-left:9pt;mso-wrap-distance-top:3.6pt;mso-wrap-distance-right:9pt;mso-wrap-distance-bottom:3.6pt;mso-position-horizontal:absolute;mso-position-horizontal-relative:text;mso-position-vertical:absolute;mso-position-vertical-relative:text;mso-width-percent:0;mso-height-percent:200;mso-width-relative:margin;mso-height-relative:margin;v-text-anchor:top" o:gfxdata="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">
+              <v:shape w14:anchorId="72B96A99" id="_x0000_s1033" type="#_x0000_t202" style="position:absolute;margin-left:279.95pt;margin-top:69.5pt;width:221.3pt;height:110.6pt;z-index:251665408;visibility:visible;mso-wrap-style:square;mso-width-percent:0;mso-height-percent:200;mso-wrap-distance-left:9pt;mso-wrap-distance-top:3.6pt;mso-wrap-distance-right:9pt;mso-wrap-distance-bottom:3.6pt;mso-position-horizontal:absolute;mso-position-horizontal-relative:text;mso-position-vertical:absolute;mso-position-vertical-relative:text;mso-width-percent:0;mso-height-percent:200;mso-width-relative:margin;mso-height-relative:margin;v-text-anchor:top" o:gfxdata="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">
                 <v:textbox style="mso-fit-shape-to-text:t">
                   <w:txbxContent>
                     <w:p>
@@ -2604,7 +1966,21 @@
                           <w:rFonts w:ascii="Times New Roman" w:hAnsi="Times New Roman" w:cs="Times New Roman"/>
                           <w:lang w:val="en-US"/>
                         </w:rPr>
-                        <w:t>elay between surgery and treatment inferior to 7 days</w:t>
+                        <w:t xml:space="preserve">elay between surgery and </w:t>
+                      </w:r>
+                      <w:r>
+                        <w:rPr>
+                          <w:rFonts w:ascii="Times New Roman" w:hAnsi="Times New Roman" w:cs="Times New Roman"/>
+                          <w:lang w:val="en-US"/>
+                        </w:rPr>
+                        <w:t>first measure</w:t>
+                      </w:r>
+                      <w:r>
+                        <w:rPr>
+                          <w:rFonts w:ascii="Times New Roman" w:hAnsi="Times New Roman" w:cs="Times New Roman"/>
+                          <w:lang w:val="en-US"/>
+                        </w:rPr>
+                        <w:t xml:space="preserve"> inferior to 7 days</w:t>
                       </w:r>
                       <w:r>
                         <w:rPr>
@@ -2655,7 +2031,14 @@
                           <w:rFonts w:ascii="Times New Roman" w:hAnsi="Times New Roman" w:cs="Times New Roman"/>
                           <w:lang w:val="en-US"/>
                         </w:rPr>
-                        <w:t>53 patients</w:t>
+                        <w:t>63</w:t>
+                      </w:r>
+                      <w:r>
+                        <w:rPr>
+                          <w:rFonts w:ascii="Times New Roman" w:hAnsi="Times New Roman" w:cs="Times New Roman"/>
+                          <w:lang w:val="en-US"/>
+                        </w:rPr>
+                        <w:t xml:space="preserve"> patients</w:t>
                       </w:r>
                     </w:p>
                   </w:txbxContent>

</xml_diff>